<commit_message>
Update bilingual CVs and add BTP and Candidate projects
</commit_message>
<xml_diff>
--- a/assets/cv/CV_Abdelkader_Arbaoui_EN.docx
+++ b/assets/cv/CV_Abdelkader_Arbaoui_EN.docx
@@ -13,33 +13,85 @@
       </w:pPr>
       <w:r>
         <w:rPr>
-          <w:b/>
-          <w:bCs/>
-          <w:color w:val="1A1A1A"/>
-          <w:sz w:val="48"/>
-          <w:szCs w:val="48"/>
-          <w:lang w:val="en-US"/>
-        </w:rPr>
-        <w:t>ABDELKADER ARBAOUI</w:t>
-      </w:r>
-      <w:r>
-        <w:rPr>
           <w:noProof/>
           <w:sz w:val="18"/>
           <w:szCs w:val="18"/>
         </w:rPr>
         <w:drawing>
-          <wp:anchor distT="0" distB="100000" distL="200000" distR="0" simplePos="0" relativeHeight="1371600" behindDoc="0" locked="0" layoutInCell="1" allowOverlap="1" wp14:anchorId="08660ED9" wp14:editId="4E545A98">
+          <wp:anchor distT="0" distB="100000" distL="60000" distR="0" simplePos="0" relativeHeight="1104900" behindDoc="0" locked="0" layoutInCell="1" allowOverlap="1" wp14:anchorId="1524692A" wp14:editId="12DD11A9">
             <wp:simplePos x="0" y="0"/>
             <wp:positionH relativeFrom="margin">
-              <wp:align>right</wp:align>
+              <wp:posOffset>4786207</wp:posOffset>
             </wp:positionH>
             <wp:positionV relativeFrom="margin">
-              <wp:align>top</wp:align>
+              <wp:posOffset>74506</wp:posOffset>
             </wp:positionV>
-            <wp:extent cx="1143000" cy="1371600"/>
-            <wp:effectExtent l="0" t="0" r="0" b="0"/>
-            <wp:wrapSquare wrapText="left" distT="0" distB="100000" distL="200000" distR="0"/>
+            <wp:extent cx="653461" cy="799253"/>
+            <wp:effectExtent l="0" t="0" r="0" b="1270"/>
+            <wp:wrapNone/>
+            <wp:docPr id="303955089" name="QR Portfolio" descr="QR code vers le portfolio" title="QR Portfolio">
+              <a:hlinkClick xmlns:a="http://schemas.openxmlformats.org/drawingml/2006/main" r:id="rId5"/>
+            </wp:docPr>
+            <wp:cNvGraphicFramePr>
+              <a:graphicFrameLocks xmlns:a="http://schemas.openxmlformats.org/drawingml/2006/main" noChangeAspect="1"/>
+            </wp:cNvGraphicFramePr>
+            <a:graphic xmlns:a="http://schemas.openxmlformats.org/drawingml/2006/main">
+              <a:graphicData uri="http://schemas.openxmlformats.org/drawingml/2006/picture">
+                <pic:pic xmlns:pic="http://schemas.openxmlformats.org/drawingml/2006/picture">
+                  <pic:nvPicPr>
+                    <pic:cNvPr id="303955089" name="QR Portfolio" descr="QR code vers le portfolio" title="QR Portfolio">
+                      <a:hlinkClick r:id="rId5"/>
+                    </pic:cNvPr>
+                    <pic:cNvPicPr>
+                      <a:picLocks noChangeAspect="1" noChangeArrowheads="1"/>
+                    </pic:cNvPicPr>
+                  </pic:nvPicPr>
+                  <pic:blipFill>
+                    <a:blip r:embed="rId6"/>
+                    <a:srcRect/>
+                    <a:stretch>
+                      <a:fillRect/>
+                    </a:stretch>
+                  </pic:blipFill>
+                  <pic:spPr bwMode="auto">
+                    <a:xfrm>
+                      <a:off x="0" y="0"/>
+                      <a:ext cx="653461" cy="799253"/>
+                    </a:xfrm>
+                    <a:prstGeom prst="rect">
+                      <a:avLst/>
+                    </a:prstGeom>
+                  </pic:spPr>
+                </pic:pic>
+              </a:graphicData>
+            </a:graphic>
+            <wp14:sizeRelH relativeFrom="margin">
+              <wp14:pctWidth>0</wp14:pctWidth>
+            </wp14:sizeRelH>
+            <wp14:sizeRelV relativeFrom="margin">
+              <wp14:pctHeight>0</wp14:pctHeight>
+            </wp14:sizeRelV>
+          </wp:anchor>
+        </w:drawing>
+      </w:r>
+      <w:r>
+        <w:rPr>
+          <w:noProof/>
+          <w:sz w:val="18"/>
+          <w:szCs w:val="18"/>
+        </w:rPr>
+        <w:drawing>
+          <wp:anchor distT="0" distB="100000" distL="201930" distR="0" simplePos="0" relativeHeight="1371600" behindDoc="0" locked="0" layoutInCell="1" allowOverlap="1" wp14:anchorId="08660ED9" wp14:editId="0B4AA53E">
+            <wp:simplePos x="0" y="0"/>
+            <wp:positionH relativeFrom="margin">
+              <wp:posOffset>5621655</wp:posOffset>
+            </wp:positionH>
+            <wp:positionV relativeFrom="margin">
+              <wp:posOffset>1</wp:posOffset>
+            </wp:positionV>
+            <wp:extent cx="784578" cy="941493"/>
+            <wp:effectExtent l="0" t="0" r="3175" b="0"/>
+            <wp:wrapNone/>
             <wp:docPr id="1" name="Photo" descr="Photo de profil" title="Photo"/>
             <wp:cNvGraphicFramePr>
               <a:graphicFrameLocks xmlns:a="http://schemas.openxmlformats.org/drawingml/2006/main" noChangeAspect="1"/>
@@ -54,63 +106,6 @@
                     </pic:cNvPicPr>
                   </pic:nvPicPr>
                   <pic:blipFill>
-                    <a:blip r:embed="rId5"/>
-                    <a:srcRect/>
-                    <a:stretch>
-                      <a:fillRect/>
-                    </a:stretch>
-                  </pic:blipFill>
-                  <pic:spPr bwMode="auto">
-                    <a:xfrm>
-                      <a:off x="0" y="0"/>
-                      <a:ext cx="1143000" cy="1371600"/>
-                    </a:xfrm>
-                    <a:prstGeom prst="rect">
-                      <a:avLst/>
-                    </a:prstGeom>
-                  </pic:spPr>
-                </pic:pic>
-              </a:graphicData>
-            </a:graphic>
-          </wp:anchor>
-        </w:drawing>
-      </w:r>
-      <w:r>
-        <w:rPr>
-          <w:noProof/>
-          <w:sz w:val="18"/>
-          <w:szCs w:val="18"/>
-        </w:rPr>
-        <w:drawing>
-          <wp:anchor distT="0" distB="100000" distL="60000" distR="0" simplePos="0" relativeHeight="1104900" behindDoc="0" locked="0" layoutInCell="1" allowOverlap="1" wp14:anchorId="1524692A" wp14:editId="6D6A2ECD">
-            <wp:simplePos x="0" y="0"/>
-            <wp:positionH relativeFrom="margin">
-              <wp:posOffset>4406435</wp:posOffset>
-            </wp:positionH>
-            <wp:positionV relativeFrom="margin">
-              <wp:align>top</wp:align>
-            </wp:positionV>
-            <wp:extent cx="904875" cy="1104900"/>
-            <wp:effectExtent l="0" t="0" r="0" b="0"/>
-            <wp:wrapSquare wrapText="left" distT="0" distB="100000" distL="60000" distR="0"/>
-            <wp:docPr id="303955089" name="QR Portfolio" descr="QR code vers le portfolio" title="QR Portfolio">
-              <a:hlinkClick xmlns:a="http://schemas.openxmlformats.org/drawingml/2006/main" r:id="rId6"/>
-            </wp:docPr>
-            <wp:cNvGraphicFramePr>
-              <a:graphicFrameLocks xmlns:a="http://schemas.openxmlformats.org/drawingml/2006/main" noChangeAspect="1"/>
-            </wp:cNvGraphicFramePr>
-            <a:graphic xmlns:a="http://schemas.openxmlformats.org/drawingml/2006/main">
-              <a:graphicData uri="http://schemas.openxmlformats.org/drawingml/2006/picture">
-                <pic:pic xmlns:pic="http://schemas.openxmlformats.org/drawingml/2006/picture">
-                  <pic:nvPicPr>
-                    <pic:cNvPr id="303955089" name="QR Portfolio" descr="QR code vers le portfolio" title="QR Portfolio">
-                      <a:hlinkClick r:id="rId6"/>
-                    </pic:cNvPr>
-                    <pic:cNvPicPr>
-                      <a:picLocks noChangeAspect="1" noChangeArrowheads="1"/>
-                    </pic:cNvPicPr>
-                  </pic:nvPicPr>
-                  <pic:blipFill>
                     <a:blip r:embed="rId7"/>
                     <a:srcRect/>
                     <a:stretch>
@@ -120,7 +115,7 @@
                   <pic:spPr bwMode="auto">
                     <a:xfrm>
                       <a:off x="0" y="0"/>
-                      <a:ext cx="904875" cy="1104900"/>
+                      <a:ext cx="784578" cy="941493"/>
                     </a:xfrm>
                     <a:prstGeom prst="rect">
                       <a:avLst/>
@@ -129,8 +124,25 @@
                 </pic:pic>
               </a:graphicData>
             </a:graphic>
+            <wp14:sizeRelH relativeFrom="margin">
+              <wp14:pctWidth>0</wp14:pctWidth>
+            </wp14:sizeRelH>
+            <wp14:sizeRelV relativeFrom="margin">
+              <wp14:pctHeight>0</wp14:pctHeight>
+            </wp14:sizeRelV>
           </wp:anchor>
         </w:drawing>
+      </w:r>
+      <w:r>
+        <w:rPr>
+          <w:b/>
+          <w:bCs/>
+          <w:color w:val="1A1A1A"/>
+          <w:sz w:val="48"/>
+          <w:szCs w:val="48"/>
+          <w:lang w:val="en-US"/>
+        </w:rPr>
+        <w:t>ABDELKADER ARBAOUI</w:t>
       </w:r>
     </w:p>
     <w:p>
@@ -262,25 +274,7 @@
           <w:szCs w:val="18"/>
           <w:lang w:val="en-US"/>
         </w:rPr>
-        <w:t>Customer Success Manager with a strong technical and commercial background built across 3 years in demanding B2B cybersecurity environments</w:t>
-      </w:r>
-      <w:r>
-        <w:rPr>
-          <w:color w:val="1A1A1A"/>
-          <w:sz w:val="18"/>
-          <w:szCs w:val="18"/>
-          <w:lang w:val="en-US"/>
-        </w:rPr>
-        <w:t xml:space="preserve">, </w:t>
-      </w:r>
-      <w:r>
-        <w:rPr>
-          <w:color w:val="1A1A1A"/>
-          <w:sz w:val="18"/>
-          <w:szCs w:val="18"/>
-          <w:lang w:val="en-US"/>
-        </w:rPr>
-        <w:t>managing enterprise (CAC 40) accounts, C-level and CISO stakeholders, and complex technical deployments. Skilled in strategic account management, contract renewals, and commercial performance analysis. Trilingual, Azure-certified, and proficient with CRM, data, and automation tools.</w:t>
+        <w:t>Trilingual professional with 3 years of experience in customer-facing and commercial roles, focused on Customer Success. Passionate about AI, data, and emerging technologies, I use data and automation to support product adoption and customer experience.</w:t>
       </w:r>
     </w:p>
     <w:p>
@@ -334,7 +328,7 @@
           <w:szCs w:val="18"/>
           <w:lang w:val="en-US"/>
         </w:rPr>
-        <w:t>CSAT · Churn · Retention · Renewals · ARR · Account Plans · QBR · SLA Reporting · NPS · Upsell · Cross-sell · Account Management</w:t>
+        <w:t>Portfolio/account health · QBR/SLA · NPS/CSAT · Retention/renewals · ARR · Upsell · Onboarding/adoption · C-level/CISO · Billing/collections · Margin</w:t>
       </w:r>
     </w:p>
     <w:p>
@@ -364,7 +358,7 @@
           <w:szCs w:val="18"/>
           <w:lang w:val="en-US"/>
         </w:rPr>
-        <w:t>Technical Implementation · Client Onboarding · Go-to-Market · Roadmap · Milestone &amp; Risk Tracking · RFP</w:t>
+        <w:t>Technical setup · Training/workshops/webinars · Adoption campaigns · Project management · Team leadership · Documentation · Voice of the customer · Roadmap/testing · RFP</w:t>
       </w:r>
     </w:p>
     <w:p>
@@ -394,47 +388,7 @@
           <w:szCs w:val="18"/>
           <w:lang w:val="en-US"/>
         </w:rPr>
-        <w:t xml:space="preserve">Salesforce · HubSpot · Jira · </w:t>
-      </w:r>
-      <w:proofErr w:type="spellStart"/>
-      <w:r>
-        <w:rPr>
-          <w:color w:val="1A1A1A"/>
-          <w:sz w:val="18"/>
-          <w:szCs w:val="18"/>
-          <w:lang w:val="en-US"/>
-        </w:rPr>
-        <w:t>Mailjet</w:t>
-      </w:r>
-      <w:proofErr w:type="spellEnd"/>
-      <w:r>
-        <w:rPr>
-          <w:color w:val="1A1A1A"/>
-          <w:sz w:val="18"/>
-          <w:szCs w:val="18"/>
-          <w:lang w:val="en-US"/>
-        </w:rPr>
-        <w:t xml:space="preserve"> · </w:t>
-      </w:r>
-      <w:proofErr w:type="spellStart"/>
-      <w:r>
-        <w:rPr>
-          <w:color w:val="1A1A1A"/>
-          <w:sz w:val="18"/>
-          <w:szCs w:val="18"/>
-          <w:lang w:val="en-US"/>
-        </w:rPr>
-        <w:t>Stonly</w:t>
-      </w:r>
-      <w:proofErr w:type="spellEnd"/>
-      <w:r>
-        <w:rPr>
-          <w:color w:val="1A1A1A"/>
-          <w:sz w:val="18"/>
-          <w:szCs w:val="18"/>
-          <w:lang w:val="en-US"/>
-        </w:rPr>
-        <w:t xml:space="preserve"> · Notion</w:t>
+        <w:t>Salesforce · HubSpot · Jira · Confluence · Notion · SharePoint</w:t>
       </w:r>
     </w:p>
     <w:p>
@@ -464,7 +418,7 @@
           <w:szCs w:val="18"/>
           <w:lang w:val="en-US"/>
         </w:rPr>
-        <w:t>CS Analytics · Power BI · OpenSearch · Power Automate · Excel · PowerPoint</w:t>
+        <w:t>Python · SQL · CS Analytics · Power BI · Excel/VBA · SAP · PowerPoint · OpenSearch · Power Automate</w:t>
       </w:r>
     </w:p>
     <w:p>
@@ -494,7 +448,7 @@
           <w:szCs w:val="18"/>
           <w:lang w:val="en-US"/>
         </w:rPr>
-        <w:t>Python · GitHub · GitLab</w:t>
+        <w:t>AI tools · GitHub/GitLab · API integration · Open Banking</w:t>
       </w:r>
     </w:p>
     <w:p>
@@ -524,7 +478,7 @@
           <w:szCs w:val="18"/>
           <w:lang w:val="en-US"/>
         </w:rPr>
-        <w:t>Emotional Intelligence · C-Level &amp; CISO Stakeholder Management · Active Listening · Adaptability · Leadership</w:t>
+        <w:t>Emotional intelligence · Stakeholder management · Active listening · Adaptability · Leadership</w:t>
       </w:r>
     </w:p>
     <w:p>
@@ -651,7 +605,7 @@
           <w:szCs w:val="18"/>
           <w:lang w:val="en-US"/>
         </w:rPr>
-        <w:t>Managed client relationships for a portfolio of 20–40 CAC 40 enterprise accounts: tracked NPS/CSAT and digital adoption, owned contract renewals with a 93% retention rate and €350K in incremental ARR, and identified upsell opportunities up to €100K</w:t>
+        <w:t>Managed ~40 accounts, from CAC 40 groups to smaller organisations: usage/account-health segmentation, NPS/CSAT, adoption, renewals (93% retention; €500K ARR) and upsell up to €100K.</w:t>
       </w:r>
     </w:p>
     <w:p>
@@ -675,7 +629,7 @@
           <w:szCs w:val="18"/>
           <w:lang w:val="en-US"/>
         </w:rPr>
-        <w:t>Delivered monthly SLA reports and 10–20 quarterly QBRs with C-level and CISO stakeholders (8–15 contacts): milestone tracking, risk management, and corrective action plans</w:t>
+        <w:t>Delivered monthly SLA reports and quarterly QBRs to C-level/CISO stakeholders, covering milestones, risks and corrective actions.</w:t>
       </w:r>
     </w:p>
     <w:p>
@@ -699,7 +653,7 @@
           <w:szCs w:val="18"/>
           <w:lang w:val="en-US"/>
         </w:rPr>
-        <w:t>Resolved 5–10 critical security incidents: cross-functional coordination (Sales, Product, Support, R&amp;D) for root cause analysis and service continuity within enterprise SLA commitments</w:t>
+        <w:t>Coordinated 5–10 security incidents with Sales, Product, Support and R&amp;D: root-cause analysis and service continuity within SLAs.</w:t>
       </w:r>
     </w:p>
     <w:p>
@@ -723,27 +677,7 @@
           <w:szCs w:val="18"/>
           <w:lang w:val="en-US"/>
         </w:rPr>
-        <w:t xml:space="preserve">Built Customer Success / Account Plans: business objectives, governance, technical onboarding for 4–10 clients, adoption </w:t>
-      </w:r>
-      <w:proofErr w:type="spellStart"/>
-      <w:r>
-        <w:rPr>
-          <w:color w:val="1A1A1A"/>
-          <w:sz w:val="18"/>
-          <w:szCs w:val="18"/>
-          <w:lang w:val="en-US"/>
-        </w:rPr>
-        <w:t>programmes</w:t>
-      </w:r>
-      <w:proofErr w:type="spellEnd"/>
-      <w:r>
-        <w:rPr>
-          <w:color w:val="1A1A1A"/>
-          <w:sz w:val="18"/>
-          <w:szCs w:val="18"/>
-          <w:lang w:val="en-US"/>
-        </w:rPr>
-        <w:t>, and GTM alignment for long-term account health</w:t>
+        <w:t>Led Customer Success Plans: objectives, governance, client setup/onboarding, 1:1 and 1:many adoption, training, webinars, email campaigns and GTM alignment.</w:t>
       </w:r>
     </w:p>
     <w:p>
@@ -767,54 +701,7 @@
           <w:szCs w:val="18"/>
           <w:lang w:val="en-US"/>
         </w:rPr>
-        <w:t>Built CS Analytics from scratch (Python) — integrated CRM, usage analytics, and automated PPTX/Power BI reporting: adopted by a 4-person team, saving 2h per report and ~€20K by avoiding a third-party CRM</w:t>
-      </w:r>
-    </w:p>
-    <w:p>
-      <w:pPr>
-        <w:tabs>
-          <w:tab w:val="right" w:pos="10306"/>
-        </w:tabs>
-        <w:spacing w:before="100"/>
-        <w:rPr>
-          <w:sz w:val="18"/>
-          <w:szCs w:val="18"/>
-          <w:lang w:val="en-US"/>
-        </w:rPr>
-      </w:pPr>
-      <w:proofErr w:type="spellStart"/>
-      <w:r>
-        <w:rPr>
-          <w:b/>
-          <w:bCs/>
-          <w:color w:val="1A1A1A"/>
-          <w:sz w:val="20"/>
-          <w:szCs w:val="20"/>
-          <w:lang w:val="en-US"/>
-        </w:rPr>
-        <w:t>Inetum</w:t>
-      </w:r>
-      <w:proofErr w:type="spellEnd"/>
-      <w:r>
-        <w:rPr>
-          <w:b/>
-          <w:bCs/>
-          <w:color w:val="1A1A1A"/>
-          <w:sz w:val="20"/>
-          <w:szCs w:val="20"/>
-          <w:lang w:val="en-US"/>
-        </w:rPr>
-        <w:t xml:space="preserve"> — Business Development Representative</w:t>
-      </w:r>
-      <w:r>
-        <w:rPr>
-          <w:color w:val="666666"/>
-          <w:sz w:val="18"/>
-          <w:szCs w:val="18"/>
-          <w:lang w:val="en-US"/>
-        </w:rPr>
-        <w:tab/>
-        <w:t>Sep 2022 – Nov 2024</w:t>
+        <w:t>Built CS Analytics in Python/SQL across CRM and usage data, automating PPTX/Power BI reporting; adopted by 4 people, saving 2h/report and ~€20K on CRM.</w:t>
       </w:r>
     </w:p>
     <w:p>
@@ -838,7 +725,7 @@
           <w:szCs w:val="18"/>
           <w:lang w:val="en-US"/>
         </w:rPr>
-        <w:t>Generated €500K+ in revenue through active prospecting (5+ meetings/week) and secured €200K+ in additional revenue by responding to strategic RFPs</w:t>
+        <w:t>Owned client billing/collections, service pricing and margin management.</w:t>
       </w:r>
     </w:p>
     <w:p>
@@ -862,7 +749,54 @@
           <w:szCs w:val="18"/>
           <w:lang w:val="en-US"/>
         </w:rPr>
-        <w:t>Led technical recruitment missions: conducted interviews with consultants to assess their assignments, skills, and availability, then matched them to client needs</w:t>
+        <w:t>Ongoing project: single documentation portal with product guides, coordinated with Product teams; brought customer needs into roadmap/user testing and supported releases, client setup and platform launches.</w:t>
+      </w:r>
+    </w:p>
+    <w:p>
+      <w:pPr>
+        <w:tabs>
+          <w:tab w:val="right" w:pos="10306"/>
+        </w:tabs>
+        <w:spacing w:before="100"/>
+        <w:rPr>
+          <w:sz w:val="18"/>
+          <w:szCs w:val="18"/>
+          <w:lang w:val="en-US"/>
+        </w:rPr>
+      </w:pPr>
+      <w:proofErr w:type="spellStart"/>
+      <w:r>
+        <w:rPr>
+          <w:b/>
+          <w:bCs/>
+          <w:color w:val="1A1A1A"/>
+          <w:sz w:val="20"/>
+          <w:szCs w:val="20"/>
+          <w:lang w:val="en-US"/>
+        </w:rPr>
+        <w:t>Inetum</w:t>
+      </w:r>
+      <w:proofErr w:type="spellEnd"/>
+      <w:r>
+        <w:rPr>
+          <w:b/>
+          <w:bCs/>
+          <w:color w:val="1A1A1A"/>
+          <w:sz w:val="20"/>
+          <w:szCs w:val="20"/>
+          <w:lang w:val="en-US"/>
+        </w:rPr>
+        <w:t xml:space="preserve"> — Business Development Representative</w:t>
+      </w:r>
+      <w:r>
+        <w:rPr>
+          <w:color w:val="666666"/>
+          <w:sz w:val="18"/>
+          <w:szCs w:val="18"/>
+          <w:lang w:val="en-US"/>
+        </w:rPr>
+        <w:tab/>
+        <w:t>Sep 2022 – Nov 2024</w:t>
       </w:r>
     </w:p>
     <w:p>
@@ -886,7 +820,7 @@
           <w:szCs w:val="18"/>
           <w:lang w:val="en-US"/>
         </w:rPr>
-        <w:t>Built an AI-powered tool to accelerate client responses by automating internal profile search, reducing time-to-match across the company's talent pool</w:t>
+        <w:t>Generated €500K+ in revenue (5+ meetings/week) and €200K+ in additional revenue through strategic RFPs.</w:t>
       </w:r>
     </w:p>
     <w:p>
@@ -903,310 +837,14 @@
           <w:lang w:val="en-US"/>
         </w:rPr>
       </w:pPr>
-      <w:proofErr w:type="spellStart"/>
-      <w:r>
-        <w:rPr>
-          <w:color w:val="1A1A1A"/>
-          <w:sz w:val="18"/>
-          <w:szCs w:val="18"/>
-          <w:lang w:val="en-US"/>
-        </w:rPr>
-        <w:t>Analysed</w:t>
-      </w:r>
-      <w:proofErr w:type="spellEnd"/>
-      <w:r>
-        <w:rPr>
-          <w:color w:val="1A1A1A"/>
-          <w:sz w:val="18"/>
-          <w:szCs w:val="18"/>
-          <w:lang w:val="en-US"/>
-        </w:rPr>
-        <w:t xml:space="preserve"> client needs and proposed tailored technical solutions (cybersecurity, cloud, infrastructure)</w:t>
-      </w:r>
-    </w:p>
-    <w:p>
-      <w:pPr>
-        <w:pBdr>
-          <w:bottom w:val="single" w:sz="6" w:space="2" w:color="C9931A"/>
-        </w:pBdr>
-        <w:spacing w:before="130" w:after="50"/>
-        <w:rPr>
-          <w:sz w:val="18"/>
-          <w:szCs w:val="18"/>
-          <w:lang w:val="en-US"/>
-        </w:rPr>
-      </w:pPr>
-      <w:r>
-        <w:rPr>
-          <w:b/>
-          <w:bCs/>
-          <w:color w:val="C9931A"/>
-          <w:sz w:val="20"/>
-          <w:szCs w:val="20"/>
-          <w:lang w:val="en-US"/>
-        </w:rPr>
-        <w:t>EDUCATION</w:t>
-      </w:r>
-    </w:p>
-    <w:p>
-      <w:pPr>
-        <w:tabs>
-          <w:tab w:val="right" w:pos="10306"/>
-        </w:tabs>
-        <w:spacing w:before="100"/>
-        <w:rPr>
-          <w:sz w:val="18"/>
-          <w:szCs w:val="18"/>
-          <w:lang w:val="en-US"/>
-        </w:rPr>
-      </w:pPr>
-      <w:r>
-        <w:rPr>
-          <w:b/>
-          <w:bCs/>
-          <w:color w:val="1A1A1A"/>
-          <w:sz w:val="20"/>
-          <w:szCs w:val="20"/>
-          <w:lang w:val="en-US"/>
-        </w:rPr>
-        <w:t>INSEEC Paris</w:t>
-      </w:r>
-      <w:r>
-        <w:rPr>
-          <w:color w:val="666666"/>
-          <w:sz w:val="18"/>
-          <w:szCs w:val="18"/>
-          <w:lang w:val="en-US"/>
-        </w:rPr>
-        <w:tab/>
-        <w:t>Sep 2025 – Sep 2026</w:t>
-      </w:r>
-    </w:p>
-    <w:p>
-      <w:pPr>
-        <w:spacing w:before="20" w:after="10"/>
-        <w:rPr>
-          <w:sz w:val="18"/>
-          <w:szCs w:val="18"/>
-          <w:lang w:val="en-US"/>
-        </w:rPr>
-      </w:pPr>
-      <w:r>
-        <w:rPr>
-          <w:color w:val="1A1A1A"/>
-          <w:sz w:val="18"/>
-          <w:szCs w:val="18"/>
-          <w:lang w:val="en-US"/>
-        </w:rPr>
-        <w:t>MSc Business Development</w:t>
-      </w:r>
-    </w:p>
-    <w:p>
-      <w:pPr>
-        <w:spacing w:before="20" w:after="60"/>
-        <w:rPr>
-          <w:sz w:val="18"/>
-          <w:szCs w:val="18"/>
-          <w:lang w:val="en-US"/>
-        </w:rPr>
-      </w:pPr>
-      <w:r>
-        <w:rPr>
-          <w:color w:val="666666"/>
-          <w:sz w:val="18"/>
-          <w:szCs w:val="18"/>
-          <w:lang w:val="en-US"/>
-        </w:rPr>
-        <w:t xml:space="preserve">Client Relations &amp; Customer </w:t>
-      </w:r>
-      <w:proofErr w:type="gramStart"/>
-      <w:r>
-        <w:rPr>
-          <w:color w:val="666666"/>
-          <w:sz w:val="18"/>
-          <w:szCs w:val="18"/>
-          <w:lang w:val="en-US"/>
-        </w:rPr>
-        <w:t>Experience  ·</w:t>
-      </w:r>
-      <w:proofErr w:type="gramEnd"/>
-      <w:r>
-        <w:rPr>
-          <w:color w:val="666666"/>
-          <w:sz w:val="18"/>
-          <w:szCs w:val="18"/>
-          <w:lang w:val="en-US"/>
-        </w:rPr>
-        <w:t xml:space="preserve">  B2B Marketing &amp; Commercial </w:t>
-      </w:r>
-      <w:proofErr w:type="gramStart"/>
-      <w:r>
-        <w:rPr>
-          <w:color w:val="666666"/>
-          <w:sz w:val="18"/>
-          <w:szCs w:val="18"/>
-          <w:lang w:val="en-US"/>
-        </w:rPr>
-        <w:t>Strategy  ·</w:t>
-      </w:r>
-      <w:proofErr w:type="gramEnd"/>
-      <w:r>
-        <w:rPr>
-          <w:color w:val="666666"/>
-          <w:sz w:val="18"/>
-          <w:szCs w:val="18"/>
-          <w:lang w:val="en-US"/>
-        </w:rPr>
-        <w:t xml:space="preserve">  Customer Journey &amp; CRM</w:t>
-      </w:r>
-    </w:p>
-    <w:p>
-      <w:pPr>
-        <w:tabs>
-          <w:tab w:val="right" w:pos="10306"/>
-        </w:tabs>
-        <w:spacing w:before="100"/>
-        <w:rPr>
-          <w:sz w:val="18"/>
-          <w:szCs w:val="18"/>
-          <w:lang w:val="en-US"/>
-        </w:rPr>
-      </w:pPr>
-      <w:r>
-        <w:rPr>
-          <w:b/>
-          <w:bCs/>
-          <w:color w:val="1A1A1A"/>
-          <w:sz w:val="20"/>
-          <w:szCs w:val="20"/>
-          <w:lang w:val="en-US"/>
-        </w:rPr>
-        <w:t>Euridis Business School</w:t>
-      </w:r>
-      <w:r>
-        <w:rPr>
-          <w:color w:val="666666"/>
-          <w:sz w:val="18"/>
-          <w:szCs w:val="18"/>
-          <w:lang w:val="en-US"/>
-        </w:rPr>
-        <w:tab/>
-        <w:t>Sep 2022 – Nov 2024</w:t>
-      </w:r>
-    </w:p>
-    <w:p>
-      <w:pPr>
-        <w:spacing w:before="20" w:after="10"/>
-        <w:rPr>
-          <w:sz w:val="18"/>
-          <w:szCs w:val="18"/>
-          <w:lang w:val="en-US"/>
-        </w:rPr>
-      </w:pPr>
-      <w:r>
-        <w:rPr>
-          <w:color w:val="1A1A1A"/>
-          <w:sz w:val="18"/>
-          <w:szCs w:val="18"/>
-          <w:lang w:val="en-US"/>
-        </w:rPr>
-        <w:t>Master in Sales Engineering</w:t>
-      </w:r>
-    </w:p>
-    <w:p>
-      <w:pPr>
-        <w:spacing w:before="20" w:after="60"/>
-        <w:rPr>
-          <w:sz w:val="18"/>
-          <w:szCs w:val="18"/>
-          <w:lang w:val="en-US"/>
-        </w:rPr>
-      </w:pPr>
-      <w:r>
-        <w:rPr>
-          <w:color w:val="666666"/>
-          <w:sz w:val="18"/>
-          <w:szCs w:val="18"/>
-          <w:lang w:val="en-US"/>
-        </w:rPr>
-        <w:t xml:space="preserve">Management, Marketing &amp; Commercial </w:t>
-      </w:r>
-      <w:proofErr w:type="gramStart"/>
-      <w:r>
-        <w:rPr>
-          <w:color w:val="666666"/>
-          <w:sz w:val="18"/>
-          <w:szCs w:val="18"/>
-          <w:lang w:val="en-US"/>
-        </w:rPr>
-        <w:t>Strategy  ·</w:t>
-      </w:r>
-      <w:proofErr w:type="gramEnd"/>
-      <w:r>
-        <w:rPr>
-          <w:color w:val="666666"/>
-          <w:sz w:val="18"/>
-          <w:szCs w:val="18"/>
-          <w:lang w:val="en-US"/>
-        </w:rPr>
-        <w:t xml:space="preserve">  Sales Negotiation &amp; Key Account Management</w:t>
-      </w:r>
-    </w:p>
-    <w:p>
-      <w:pPr>
-        <w:pBdr>
-          <w:bottom w:val="single" w:sz="6" w:space="2" w:color="C9931A"/>
-        </w:pBdr>
-        <w:spacing w:before="130" w:after="50"/>
-        <w:rPr>
-          <w:sz w:val="18"/>
-          <w:szCs w:val="18"/>
-          <w:lang w:val="en-US"/>
-        </w:rPr>
-      </w:pPr>
-      <w:r>
-        <w:rPr>
-          <w:b/>
-          <w:bCs/>
-          <w:color w:val="C9931A"/>
-          <w:sz w:val="20"/>
-          <w:szCs w:val="20"/>
-          <w:lang w:val="en-US"/>
-        </w:rPr>
-        <w:t>PERSONAL PROJECTS</w:t>
-      </w:r>
-    </w:p>
-    <w:p>
-      <w:pPr>
-        <w:tabs>
-          <w:tab w:val="right" w:pos="10306"/>
-        </w:tabs>
-        <w:spacing w:before="100"/>
-        <w:rPr>
-          <w:sz w:val="18"/>
-          <w:szCs w:val="18"/>
-          <w:lang w:val="en-US"/>
-        </w:rPr>
-      </w:pPr>
-      <w:r>
-        <w:rPr>
-          <w:b/>
-          <w:bCs/>
-          <w:color w:val="1A1A1A"/>
-          <w:sz w:val="20"/>
-          <w:szCs w:val="20"/>
-          <w:lang w:val="en-US"/>
-        </w:rPr>
-        <w:t>Money Tracker v2.1 — Personal Finance Application (Local)</w:t>
-      </w:r>
-      <w:r>
-        <w:rPr>
-          <w:color w:val="666666"/>
-          <w:sz w:val="18"/>
-          <w:szCs w:val="18"/>
-          <w:lang w:val="en-US"/>
-        </w:rPr>
-        <w:tab/>
+      <w:r>
+        <w:rPr>
+          <w:color w:val="1A1A1A"/>
+          <w:sz w:val="18"/>
+          <w:szCs w:val="18"/>
+          <w:lang w:val="en-US"/>
+        </w:rPr>
+        <w:t>Interviewed consultants on assignments, skills and availability, then matched them to client opportunities.</w:t>
       </w:r>
     </w:p>
     <w:p>
@@ -1230,39 +868,8 @@
           <w:szCs w:val="18"/>
           <w:lang w:val="en-US"/>
         </w:rPr>
-        <w:t xml:space="preserve">Designed a personal finance app </w:t>
-      </w:r>
-      <w:proofErr w:type="spellStart"/>
-      <w:r>
-        <w:rPr>
-          <w:color w:val="1A1A1A"/>
-          <w:sz w:val="18"/>
-          <w:szCs w:val="18"/>
-          <w:lang w:val="en-US"/>
-        </w:rPr>
-        <w:t>centralising</w:t>
-      </w:r>
-      <w:proofErr w:type="spellEnd"/>
-      <w:r>
-        <w:rPr>
-          <w:color w:val="1A1A1A"/>
-          <w:sz w:val="18"/>
-          <w:szCs w:val="18"/>
-          <w:lang w:val="en-US"/>
-        </w:rPr>
-        <w:t xml:space="preserve"> all bank and investment accounts: subscription &amp; direct debit tracking, investment forecasting, real-time consolidated net worth </w:t>
-      </w:r>
-      <w:proofErr w:type="gramStart"/>
-      <w:r>
-        <w:rPr>
-          <w:color w:val="1A1A1A"/>
-          <w:sz w:val="18"/>
-          <w:szCs w:val="18"/>
-          <w:lang w:val="en-US"/>
-        </w:rPr>
-        <w:t>view</w:t>
-      </w:r>
-      <w:proofErr w:type="gramEnd"/>
+        <w:t>Built an AI tool for internal profile search and drove adoption through task allocation, user coaching and internal training documentation.</w:t>
+      </w:r>
     </w:p>
     <w:p>
       <w:pPr>
@@ -1285,7 +892,7 @@
           <w:szCs w:val="18"/>
           <w:lang w:val="en-US"/>
         </w:rPr>
-        <w:t>EU banking integration via GoCardless Open Banking (Revolut, SG, 2,000+ banks) and investment tracking via Trade Republic API</w:t>
+        <w:t>Analysed client needs and proposed cybersecurity, cloud and infrastructure solutions.</w:t>
       </w:r>
     </w:p>
     <w:p>
@@ -1309,107 +916,7 @@
           <w:szCs w:val="18"/>
           <w:lang w:val="en-US"/>
         </w:rPr>
-        <w:t xml:space="preserve">Backend: Python / </w:t>
-      </w:r>
-      <w:proofErr w:type="spellStart"/>
-      <w:r>
-        <w:rPr>
-          <w:color w:val="1A1A1A"/>
-          <w:sz w:val="18"/>
-          <w:szCs w:val="18"/>
-          <w:lang w:val="en-US"/>
-        </w:rPr>
-        <w:t>FastAPI</w:t>
-      </w:r>
-      <w:proofErr w:type="spellEnd"/>
-      <w:r>
-        <w:rPr>
-          <w:color w:val="1A1A1A"/>
-          <w:sz w:val="18"/>
-          <w:szCs w:val="18"/>
-          <w:lang w:val="en-US"/>
-        </w:rPr>
-        <w:t xml:space="preserve"> · </w:t>
-      </w:r>
-      <w:proofErr w:type="spellStart"/>
-      <w:r>
-        <w:rPr>
-          <w:color w:val="1A1A1A"/>
-          <w:sz w:val="18"/>
-          <w:szCs w:val="18"/>
-          <w:lang w:val="en-US"/>
-        </w:rPr>
-        <w:t>SQLAlchemy</w:t>
-      </w:r>
-      <w:proofErr w:type="spellEnd"/>
-      <w:r>
-        <w:rPr>
-          <w:color w:val="1A1A1A"/>
-          <w:sz w:val="18"/>
-          <w:szCs w:val="18"/>
-          <w:lang w:val="en-US"/>
-        </w:rPr>
-        <w:t xml:space="preserve"> · SQLite · </w:t>
-      </w:r>
-      <w:proofErr w:type="spellStart"/>
-      <w:r>
-        <w:rPr>
-          <w:color w:val="1A1A1A"/>
-          <w:sz w:val="18"/>
-          <w:szCs w:val="18"/>
-          <w:lang w:val="en-US"/>
-        </w:rPr>
-        <w:t>Pydantic</w:t>
-      </w:r>
-      <w:proofErr w:type="spellEnd"/>
-      <w:r>
-        <w:rPr>
-          <w:color w:val="1A1A1A"/>
-          <w:sz w:val="18"/>
-          <w:szCs w:val="18"/>
-          <w:lang w:val="en-US"/>
-        </w:rPr>
-        <w:t xml:space="preserve"> v</w:t>
-      </w:r>
-      <w:proofErr w:type="gramStart"/>
-      <w:r>
-        <w:rPr>
-          <w:color w:val="1A1A1A"/>
-          <w:sz w:val="18"/>
-          <w:szCs w:val="18"/>
-          <w:lang w:val="en-US"/>
-        </w:rPr>
-        <w:t>2  |</w:t>
-      </w:r>
-      <w:proofErr w:type="gramEnd"/>
-      <w:r>
-        <w:rPr>
-          <w:color w:val="1A1A1A"/>
-          <w:sz w:val="18"/>
-          <w:szCs w:val="18"/>
-          <w:lang w:val="en-US"/>
-        </w:rPr>
-        <w:t xml:space="preserve">  Frontend: React 18 · Vite · Tailwind CSS · </w:t>
-      </w:r>
-      <w:proofErr w:type="gramStart"/>
-      <w:r>
-        <w:rPr>
-          <w:color w:val="1A1A1A"/>
-          <w:sz w:val="18"/>
-          <w:szCs w:val="18"/>
-          <w:lang w:val="en-US"/>
-        </w:rPr>
-        <w:t>Recharts  |</w:t>
-      </w:r>
-      <w:proofErr w:type="gramEnd"/>
-      <w:r>
-        <w:rPr>
-          <w:color w:val="1A1A1A"/>
-          <w:sz w:val="18"/>
-          <w:szCs w:val="18"/>
-          <w:lang w:val="en-US"/>
-        </w:rPr>
-        <w:t xml:space="preserve">  Security: AES-128 (Fernet) · keyring · X-API-Key</w:t>
+        <w:t>Led five consultants/developers: follow-up, assignments, training, mentoring, corrective feedback and conflict resolution.</w:t>
       </w:r>
     </w:p>
     <w:p>
@@ -1433,138 +940,340 @@
           <w:szCs w:val="20"/>
           <w:lang w:val="en-US"/>
         </w:rPr>
-        <w:t>ADDITIONAL INFORMATION</w:t>
-      </w:r>
-    </w:p>
-    <w:p>
-      <w:pPr>
-        <w:spacing w:before="20" w:after="10"/>
-        <w:rPr>
-          <w:sz w:val="18"/>
-          <w:szCs w:val="18"/>
-          <w:lang w:val="en-US"/>
-        </w:rPr>
-      </w:pPr>
-      <w:proofErr w:type="gramStart"/>
+        <w:t>EDUCATION</w:t>
+      </w:r>
+    </w:p>
+    <w:p>
+      <w:pPr>
+        <w:tabs>
+          <w:tab w:val="right" w:pos="10306"/>
+        </w:tabs>
+        <w:spacing w:before="100"/>
+        <w:rPr>
+          <w:sz w:val="18"/>
+          <w:szCs w:val="18"/>
+          <w:lang w:val="en-US"/>
+        </w:rPr>
+      </w:pPr>
       <w:r>
         <w:rPr>
           <w:b/>
           <w:bCs/>
           <w:color w:val="1A1A1A"/>
-          <w:sz w:val="18"/>
-          <w:szCs w:val="18"/>
-          <w:lang w:val="en-US"/>
-        </w:rPr>
-        <w:t>Languages</w:t>
-      </w:r>
+          <w:sz w:val="20"/>
+          <w:szCs w:val="20"/>
+          <w:lang w:val="en-US"/>
+        </w:rPr>
+        <w:t>INSEEC Paris</w:t>
+      </w:r>
+      <w:r>
+        <w:rPr>
+          <w:color w:val="666666"/>
+          <w:sz w:val="18"/>
+          <w:szCs w:val="18"/>
+          <w:lang w:val="en-US"/>
+        </w:rPr>
+        <w:tab/>
+        <w:t>Sep 2025 – Sep 2026</w:t>
+      </w:r>
+    </w:p>
+    <w:p>
+      <w:pPr>
+        <w:spacing w:before="20" w:after="10"/>
+        <w:rPr>
+          <w:sz w:val="18"/>
+          <w:szCs w:val="18"/>
+          <w:lang w:val="en-US"/>
+        </w:rPr>
+      </w:pPr>
+      <w:r>
+        <w:rPr>
+          <w:color w:val="1A1A1A"/>
+          <w:sz w:val="18"/>
+          <w:szCs w:val="18"/>
+          <w:lang w:val="en-US"/>
+        </w:rPr>
+        <w:t>MSc Business Development</w:t>
+      </w:r>
+    </w:p>
+    <w:p>
+      <w:pPr>
+        <w:tabs>
+          <w:tab w:val="right" w:pos="10306"/>
+        </w:tabs>
+        <w:spacing w:before="100"/>
+        <w:rPr>
+          <w:sz w:val="18"/>
+          <w:szCs w:val="18"/>
+          <w:lang w:val="en-US"/>
+        </w:rPr>
+      </w:pPr>
       <w:r>
         <w:rPr>
           <w:b/>
           <w:bCs/>
           <w:color w:val="1A1A1A"/>
-          <w:sz w:val="18"/>
-          <w:szCs w:val="18"/>
-          <w:lang w:val="en-US"/>
-        </w:rPr>
-        <w:t xml:space="preserve"> </w:t>
-      </w:r>
+          <w:sz w:val="20"/>
+          <w:szCs w:val="20"/>
+          <w:lang w:val="en-US"/>
+        </w:rPr>
+        <w:t>Euridis Business School</w:t>
+      </w:r>
+      <w:r>
+        <w:rPr>
+          <w:color w:val="666666"/>
+          <w:sz w:val="18"/>
+          <w:szCs w:val="18"/>
+          <w:lang w:val="en-US"/>
+        </w:rPr>
+        <w:tab/>
+        <w:t>Sep 2022 – Nov 2024</w:t>
+      </w:r>
+    </w:p>
+    <w:p>
+      <w:pPr>
+        <w:spacing w:before="20" w:after="10"/>
+        <w:rPr>
+          <w:sz w:val="18"/>
+          <w:szCs w:val="18"/>
+          <w:lang w:val="en-US"/>
+        </w:rPr>
+      </w:pPr>
+      <w:r>
+        <w:rPr>
+          <w:color w:val="1A1A1A"/>
+          <w:sz w:val="18"/>
+          <w:szCs w:val="18"/>
+          <w:lang w:val="en-US"/>
+        </w:rPr>
+        <w:t>Master in Sales Engineering</w:t>
+      </w:r>
+    </w:p>
+    <w:p>
+      <w:pPr>
+        <w:pBdr>
+          <w:bottom w:val="single" w:sz="6" w:space="2" w:color="C9931A"/>
+        </w:pBdr>
+        <w:spacing w:before="130" w:after="50"/>
+        <w:rPr>
+          <w:sz w:val="18"/>
+          <w:szCs w:val="18"/>
+          <w:lang w:val="en-US"/>
+        </w:rPr>
+      </w:pPr>
       <w:r>
         <w:rPr>
           <w:b/>
           <w:bCs/>
-          <w:color w:val="1A1A1A"/>
-          <w:sz w:val="18"/>
-          <w:szCs w:val="18"/>
-          <w:lang w:val="en-US"/>
-        </w:rPr>
-        <w:t>:</w:t>
-      </w:r>
-      <w:proofErr w:type="gramEnd"/>
-      <w:r>
-        <w:rPr>
-          <w:color w:val="1A1A1A"/>
-          <w:sz w:val="18"/>
-          <w:szCs w:val="18"/>
-          <w:lang w:val="en-US"/>
-        </w:rPr>
-        <w:t xml:space="preserve"> French (C2), English (C1), Arabic (C2)</w:t>
-      </w:r>
-    </w:p>
-    <w:p>
-      <w:pPr>
-        <w:spacing w:before="20" w:after="10"/>
-        <w:rPr>
-          <w:sz w:val="18"/>
-          <w:szCs w:val="18"/>
-          <w:lang w:val="en-US"/>
-        </w:rPr>
-      </w:pPr>
-      <w:proofErr w:type="gramStart"/>
+          <w:color w:val="C9931A"/>
+          <w:sz w:val="20"/>
+          <w:szCs w:val="20"/>
+          <w:lang w:val="en-US"/>
+        </w:rPr>
+        <w:t>PERSONAL PROJECTS</w:t>
+      </w:r>
+    </w:p>
+    <w:p>
+      <w:pPr>
+        <w:tabs>
+          <w:tab w:val="right" w:pos="10306"/>
+        </w:tabs>
+        <w:spacing w:before="100"/>
+        <w:rPr>
+          <w:sz w:val="18"/>
+          <w:szCs w:val="18"/>
+          <w:lang w:val="en-US"/>
+        </w:rPr>
+      </w:pPr>
       <w:r>
         <w:rPr>
           <w:b/>
           <w:bCs/>
           <w:color w:val="1A1A1A"/>
-          <w:sz w:val="18"/>
-          <w:szCs w:val="18"/>
-          <w:lang w:val="en-US"/>
-        </w:rPr>
-        <w:t>Certifications</w:t>
-      </w:r>
+          <w:sz w:val="20"/>
+          <w:szCs w:val="20"/>
+          <w:lang w:val="en-US"/>
+        </w:rPr>
+        <w:t>MONEY TRACKER — Personal Finance Application (Local)</w:t>
+      </w:r>
+    </w:p>
+    <w:p>
+      <w:pPr>
+        <w:pStyle w:val="Paragraphedeliste"/>
+        <w:numPr>
+          <w:ilvl w:val="0"/>
+          <w:numId w:val="2"/>
+        </w:numPr>
+        <w:spacing w:before="20" w:after="20"/>
+        <w:rPr>
+          <w:sz w:val="18"/>
+          <w:szCs w:val="18"/>
+          <w:lang w:val="en-US"/>
+        </w:rPr>
+      </w:pPr>
+      <w:r>
+        <w:rPr>
+          <w:color w:val="1A1A1A"/>
+          <w:sz w:val="18"/>
+          <w:szCs w:val="18"/>
+          <w:lang w:val="en-US"/>
+        </w:rPr>
+        <w:t>Designed a local app for bank/investment accounts, subscriptions, forecasts and consolidated net worth.</w:t>
+      </w:r>
+    </w:p>
+    <w:p>
+      <w:pPr>
+        <w:pStyle w:val="Paragraphedeliste"/>
+        <w:numPr>
+          <w:ilvl w:val="0"/>
+          <w:numId w:val="2"/>
+        </w:numPr>
+        <w:spacing w:before="20" w:after="20"/>
+        <w:rPr>
+          <w:sz w:val="18"/>
+          <w:szCs w:val="18"/>
+          <w:lang w:val="en-US"/>
+        </w:rPr>
+      </w:pPr>
+      <w:r>
+        <w:rPr>
+          <w:color w:val="1A1A1A"/>
+          <w:sz w:val="18"/>
+          <w:szCs w:val="18"/>
+          <w:lang w:val="en-US"/>
+        </w:rPr>
+        <w:t>GoCardless Open Banking, Trade Republic API; Python/FastAPI, SQLAlchemy, SQLite, Pydantic, React/Vite, Tailwind, Recharts, Fernet, keyring, X-API-Key.</w:t>
+      </w:r>
+    </w:p>
+    <w:p>
+      <w:pPr>
+        <w:tabs>
+          <w:tab w:val="right" w:pos="10306"/>
+        </w:tabs>
+        <w:spacing w:before="100"/>
+        <w:rPr>
+          <w:sz w:val="18"/>
+          <w:szCs w:val="18"/>
+          <w:lang w:val="en-US"/>
+        </w:rPr>
+      </w:pPr>
       <w:r>
         <w:rPr>
           <w:b/>
           <w:bCs/>
           <w:color w:val="1A1A1A"/>
-          <w:sz w:val="18"/>
-          <w:szCs w:val="18"/>
-          <w:lang w:val="en-US"/>
-        </w:rPr>
-        <w:t xml:space="preserve"> </w:t>
-      </w:r>
+          <w:sz w:val="20"/>
+          <w:szCs w:val="20"/>
+          <w:lang w:val="en-US"/>
+        </w:rPr>
+        <w:t>SAP DASHBOARDS — Financial Consolidation (Excel/VBA)</w:t>
+      </w:r>
+    </w:p>
+    <w:p>
+      <w:pPr>
+        <w:pStyle w:val="Paragraphedeliste"/>
+        <w:numPr>
+          <w:ilvl w:val="0"/>
+          <w:numId w:val="2"/>
+        </w:numPr>
+        <w:spacing w:before="20" w:after="20"/>
+        <w:rPr>
+          <w:sz w:val="18"/>
+          <w:szCs w:val="18"/>
+          <w:lang w:val="en-US"/>
+        </w:rPr>
+      </w:pPr>
+      <w:r>
+        <w:rPr>
+          <w:color w:val="1A1A1A"/>
+          <w:sz w:val="18"/>
+          <w:szCs w:val="18"/>
+          <w:lang w:val="en-US"/>
+        </w:rPr>
+        <w:t>Automated SAP trial-balance consolidation into Magnitude statements using Excel/VBA, account mapping, debit/credit controls and PDF export.</w:t>
+      </w:r>
+    </w:p>
+    <w:p>
+      <w:pPr>
+        <w:tabs>
+          <w:tab w:val="right" w:pos="10306"/>
+        </w:tabs>
+        <w:spacing w:before="100"/>
+        <w:rPr>
+          <w:sz w:val="18"/>
+          <w:szCs w:val="18"/>
+          <w:lang w:val="en-US"/>
+        </w:rPr>
+      </w:pPr>
       <w:r>
         <w:rPr>
           <w:b/>
           <w:bCs/>
           <w:color w:val="1A1A1A"/>
-          <w:sz w:val="18"/>
-          <w:szCs w:val="18"/>
-          <w:lang w:val="en-US"/>
-        </w:rPr>
-        <w:t>:</w:t>
-      </w:r>
-      <w:proofErr w:type="gramEnd"/>
-      <w:r>
-        <w:rPr>
-          <w:color w:val="1A1A1A"/>
-          <w:sz w:val="18"/>
-          <w:szCs w:val="18"/>
-          <w:lang w:val="en-US"/>
-        </w:rPr>
-        <w:t xml:space="preserve"> Microsoft AZ-900 (Azure Fundamentals)</w:t>
-      </w:r>
-    </w:p>
-    <w:p>
-      <w:pPr>
-        <w:spacing w:before="20"/>
-        <w:rPr>
-          <w:sz w:val="18"/>
-          <w:szCs w:val="18"/>
-          <w:lang w:val="en-US"/>
-        </w:rPr>
-      </w:pPr>
-      <w:proofErr w:type="gramStart"/>
+          <w:sz w:val="20"/>
+          <w:szCs w:val="20"/>
+          <w:lang w:val="en-US"/>
+        </w:rPr>
+        <w:t>BTP COPILOT — AI Tendering Product Framing</w:t>
+      </w:r>
+    </w:p>
+    <w:p>
+      <w:pPr>
+        <w:pStyle w:val="Paragraphedeliste"/>
+        <w:numPr>
+          <w:ilvl w:val="0"/>
+          <w:numId w:val="2"/>
+        </w:numPr>
+        <w:spacing w:before="20" w:after="20"/>
+        <w:rPr>
+          <w:sz w:val="18"/>
+          <w:szCs w:val="18"/>
+          <w:lang w:val="en-US"/>
+        </w:rPr>
+      </w:pPr>
+      <w:r>
+        <w:rPr>
+          <w:color w:val="1A1A1A"/>
+          <w:sz w:val="18"/>
+          <w:szCs w:val="18"/>
+          <w:lang w:val="en-US"/>
+        </w:rPr>
+        <w:t>Framed an AI copilot for construction SMEs: BOAMP/TED/DECP monitoring, go/no-go and tender analysis with traceable evidence/unknowns; Supabase/Hermes architecture, human review, no automatic submission.</w:t>
+      </w:r>
+    </w:p>
+    <w:p>
+      <w:pPr>
+        <w:pBdr>
+          <w:bottom w:val="single" w:sz="6" w:space="2" w:color="C9931A"/>
+        </w:pBdr>
+        <w:spacing w:before="130" w:after="50"/>
+        <w:rPr>
+          <w:sz w:val="18"/>
+          <w:szCs w:val="18"/>
+          <w:lang w:val="en-US"/>
+        </w:rPr>
+      </w:pPr>
       <w:r>
         <w:rPr>
           <w:b/>
           <w:bCs/>
-          <w:color w:val="1A1A1A"/>
-          <w:sz w:val="18"/>
-          <w:szCs w:val="18"/>
-          <w:lang w:val="en-US"/>
-        </w:rPr>
-        <w:t>Interests</w:t>
-      </w:r>
+          <w:color w:val="C9931A"/>
+          <w:sz w:val="20"/>
+          <w:szCs w:val="20"/>
+          <w:lang w:val="en-US"/>
+        </w:rPr>
+        <w:t>ADDITIONAL INFORMATION</w:t>
+      </w:r>
+    </w:p>
+    <w:p>
+      <w:pPr>
+        <w:spacing w:before="20" w:after="10"/>
+        <w:rPr>
+          <w:sz w:val="18"/>
+          <w:szCs w:val="18"/>
+          <w:lang w:val="en-US"/>
+        </w:rPr>
+      </w:pPr>
       <w:r>
         <w:rPr>
           <w:b/>
@@ -1574,28 +1283,7 @@
           <w:szCs w:val="18"/>
           <w:lang w:val="en-US"/>
         </w:rPr>
-        <w:t xml:space="preserve"> </w:t>
-      </w:r>
-      <w:r>
-        <w:rPr>
-          <w:b/>
-          <w:bCs/>
-          <w:color w:val="1A1A1A"/>
-          <w:sz w:val="18"/>
-          <w:szCs w:val="18"/>
-          <w:lang w:val="en-US"/>
-        </w:rPr>
-        <w:t>:</w:t>
-      </w:r>
-      <w:proofErr w:type="gramEnd"/>
-      <w:r>
-        <w:rPr>
-          <w:color w:val="1A1A1A"/>
-          <w:sz w:val="18"/>
-          <w:szCs w:val="18"/>
-          <w:lang w:val="en-US"/>
-        </w:rPr>
-        <w:t xml:space="preserve"> Sport, Travel, Astronomy, Cooking</w:t>
+        <w:t>Languages: French (C2), English (C1), Arabic (C2) · Microsoft AZ-900 (Azure Fundamentals)</w:t>
       </w:r>
     </w:p>
     <w:sectPr>

</xml_diff>

<commit_message>
Update FR/EN CV: add JobLeaf, drop other personal projects, Education after projects
</commit_message>
<xml_diff>
--- a/assets/cv/CV_Abdelkader_Arbaoui_EN.docx
+++ b/assets/cv/CV_Abdelkader_Arbaoui_EN.docx
@@ -940,7 +940,7 @@
           <w:szCs w:val="20"/>
           <w:lang w:val="en-US"/>
         </w:rPr>
-        <w:t>EDUCATION</w:t>
+        <w:t>PERSONAL PROJECTS</w:t>
       </w:r>
     </w:p>
     <w:p>
@@ -949,152 +949,40 @@
           <w:tab w:val="right" w:pos="10306"/>
         </w:tabs>
         <w:spacing w:before="100"/>
-        <w:rPr>
-          <w:sz w:val="18"/>
-          <w:szCs w:val="18"/>
-          <w:lang w:val="en-US"/>
-        </w:rPr>
+        <w:jc w:val="both"/>
       </w:pPr>
       <w:r>
         <w:rPr>
           <w:b/>
           <w:bCs/>
           <w:color w:val="1A1A1A"/>
-          <w:sz w:val="20"/>
-          <w:szCs w:val="20"/>
-          <w:lang w:val="en-US"/>
-        </w:rPr>
-        <w:t>INSEEC Paris</w:t>
+          <w:sz w:val="19"/>
+          <w:szCs w:val="19"/>
+        </w:rPr>
+        <w:t xml:space="preserve">JobLeaf — Creator &amp; Product Owner — Job-search SaaS (jobleaf.app)</w:t>
       </w:r>
       <w:r>
         <w:rPr>
           <w:color w:val="666666"/>
-          <w:sz w:val="18"/>
-          <w:szCs w:val="18"/>
-          <w:lang w:val="en-US"/>
         </w:rPr>
         <w:tab/>
-        <w:t>Sep 2025 – Sep 2026</w:t>
-      </w:r>
-    </w:p>
-    <w:p>
-      <w:pPr>
-        <w:spacing w:before="20" w:after="10"/>
-        <w:rPr>
-          <w:sz w:val="18"/>
-          <w:szCs w:val="18"/>
-          <w:lang w:val="en-US"/>
-        </w:rPr>
-      </w:pPr>
-      <w:r>
-        <w:rPr>
-          <w:color w:val="1A1A1A"/>
-          <w:sz w:val="18"/>
-          <w:szCs w:val="18"/>
-          <w:lang w:val="en-US"/>
-        </w:rPr>
-        <w:t>MSc Business Development</w:t>
-      </w:r>
-    </w:p>
-    <w:p>
-      <w:pPr>
-        <w:tabs>
-          <w:tab w:val="right" w:pos="10306"/>
-        </w:tabs>
-        <w:spacing w:before="100"/>
-        <w:rPr>
-          <w:sz w:val="18"/>
-          <w:szCs w:val="18"/>
-          <w:lang w:val="en-US"/>
-        </w:rPr>
-      </w:pPr>
-      <w:r>
-        <w:rPr>
-          <w:b/>
-          <w:bCs/>
-          <w:color w:val="1A1A1A"/>
-          <w:sz w:val="20"/>
-          <w:szCs w:val="20"/>
-          <w:lang w:val="en-US"/>
-        </w:rPr>
-        <w:t>Euridis Business School</w:t>
-      </w:r>
-      <w:r>
-        <w:rPr>
+        <w:t>2026 – Present</w:t>
+      </w:r>
+    </w:p>
+    <w:p>
+      <w:pPr>
+        <w:spacing w:after="40"/>
+        <w:jc w:val="both"/>
+      </w:pPr>
+      <w:r>
+        <w:rPr>
+          <w:i/>
+          <w:iCs/>
           <w:color w:val="666666"/>
-          <w:sz w:val="18"/>
-          <w:szCs w:val="18"/>
-          <w:lang w:val="en-US"/>
-        </w:rPr>
-        <w:tab/>
-        <w:t>Sep 2022 – Nov 2024</w:t>
-      </w:r>
-    </w:p>
-    <w:p>
-      <w:pPr>
-        <w:spacing w:before="20" w:after="10"/>
-        <w:rPr>
-          <w:sz w:val="18"/>
-          <w:szCs w:val="18"/>
-          <w:lang w:val="en-US"/>
-        </w:rPr>
-      </w:pPr>
-      <w:r>
-        <w:rPr>
-          <w:color w:val="1A1A1A"/>
-          <w:sz w:val="18"/>
-          <w:szCs w:val="18"/>
-          <w:lang w:val="en-US"/>
-        </w:rPr>
-        <w:t>Master in Sales Engineering</w:t>
-      </w:r>
-    </w:p>
-    <w:p>
-      <w:pPr>
-        <w:pBdr>
-          <w:bottom w:val="single" w:sz="6" w:space="2" w:color="C9931A"/>
-        </w:pBdr>
-        <w:spacing w:before="130" w:after="50"/>
-        <w:rPr>
-          <w:sz w:val="18"/>
-          <w:szCs w:val="18"/>
-          <w:lang w:val="en-US"/>
-        </w:rPr>
-      </w:pPr>
-      <w:r>
-        <w:rPr>
-          <w:b/>
-          <w:bCs/>
-          <w:color w:val="C9931A"/>
-          <w:sz w:val="20"/>
-          <w:szCs w:val="20"/>
-          <w:lang w:val="en-US"/>
-        </w:rPr>
-        <w:t>PERSONAL PROJECTS</w:t>
-      </w:r>
-    </w:p>
-    <w:p>
-      <w:pPr>
-        <w:tabs>
-          <w:tab w:val="right" w:pos="10306"/>
-        </w:tabs>
-        <w:spacing w:before="100"/>
-        <w:rPr>
-          <w:sz w:val="18"/>
-          <w:szCs w:val="18"/>
-          <w:lang w:val="en-US"/>
-        </w:rPr>
-      </w:pPr>
-      <w:r>
-        <w:rPr>
-          <w:b/>
-          <w:bCs/>
-          <w:color w:val="1A1A1A"/>
-          <w:sz w:val="20"/>
-          <w:szCs w:val="20"/>
-          <w:lang w:val="en-US"/>
-        </w:rPr>
-        <w:t>MONEY TRACKER — Personal Finance Application (Local)</w:t>
+          <w:sz w:val="16"/>
+          <w:szCs w:val="16"/>
+        </w:rPr>
+        <w:t xml:space="preserve">Web platform that tells job seekers what to do next: tracking, offer-to-background analysis, tailored résumé, never inventing facts or applying for them.</w:t>
       </w:r>
     </w:p>
     <w:p>
@@ -1105,20 +993,13 @@
           <w:numId w:val="2"/>
         </w:numPr>
         <w:spacing w:before="20" w:after="20"/>
-        <w:rPr>
-          <w:sz w:val="18"/>
-          <w:szCs w:val="18"/>
-          <w:lang w:val="en-US"/>
-        </w:rPr>
-      </w:pPr>
-      <w:r>
-        <w:rPr>
-          <w:color w:val="1A1A1A"/>
-          <w:sz w:val="18"/>
-          <w:szCs w:val="18"/>
-          <w:lang w:val="en-US"/>
-        </w:rPr>
-        <w:t>Designed a local app for bank/investment accounts, subscriptions, forecasts and consolidated net worth.</w:t>
+        <w:jc w:val="both"/>
+      </w:pPr>
+      <w:r>
+        <w:rPr>
+          <w:color w:val="1A1A1A"/>
+        </w:rPr>
+        <w:t xml:space="preserve">Designed and deployed to production a multi-tenant SaaS (Node.js/Express, Supabase/PostgreSQL, Cloudflare, Stripe, PostHog): per-account data isolation (RLS), 850+ automated tests, versioned releases with rollback.</w:t>
       </w:r>
     </w:p>
     <w:p>
@@ -1129,44 +1010,13 @@
           <w:numId w:val="2"/>
         </w:numPr>
         <w:spacing w:before="20" w:after="20"/>
-        <w:rPr>
-          <w:sz w:val="18"/>
-          <w:szCs w:val="18"/>
-          <w:lang w:val="en-US"/>
-        </w:rPr>
-      </w:pPr>
-      <w:r>
-        <w:rPr>
-          <w:color w:val="1A1A1A"/>
-          <w:sz w:val="18"/>
-          <w:szCs w:val="18"/>
-          <w:lang w:val="en-US"/>
-        </w:rPr>
-        <w:t>GoCardless Open Banking, Trade Republic API; Python/FastAPI, SQLAlchemy, SQLite, Pydantic, React/Vite, Tailwind, Recharts, Fernet, keyring, X-API-Key.</w:t>
-      </w:r>
-    </w:p>
-    <w:p>
-      <w:pPr>
-        <w:tabs>
-          <w:tab w:val="right" w:pos="10306"/>
-        </w:tabs>
-        <w:spacing w:before="100"/>
-        <w:rPr>
-          <w:sz w:val="18"/>
-          <w:szCs w:val="18"/>
-          <w:lang w:val="en-US"/>
-        </w:rPr>
-      </w:pPr>
-      <w:r>
-        <w:rPr>
-          <w:b/>
-          <w:bCs/>
-          <w:color w:val="1A1A1A"/>
-          <w:sz w:val="20"/>
-          <w:szCs w:val="20"/>
-          <w:lang w:val="en-US"/>
-        </w:rPr>
-        <w:t>SAP DASHBOARDS — Financial Consolidation (Excel/VBA)</w:t>
+        <w:jc w:val="both"/>
+      </w:pPr>
+      <w:r>
+        <w:rPr>
+          <w:color w:val="1A1A1A"/>
+        </w:rPr>
+        <w:t xml:space="preserve">Defined and built the onboarding: 4-step “Getting started” path (import résumé, import offer, first application, first analysis) ticked from real usage, plus 5 welcome credits, to bring each new user to first value without hand-holding.</w:t>
       </w:r>
     </w:p>
     <w:p>
@@ -1177,44 +1027,13 @@
           <w:numId w:val="2"/>
         </w:numPr>
         <w:spacing w:before="20" w:after="20"/>
-        <w:rPr>
-          <w:sz w:val="18"/>
-          <w:szCs w:val="18"/>
-          <w:lang w:val="en-US"/>
-        </w:rPr>
-      </w:pPr>
-      <w:r>
-        <w:rPr>
-          <w:color w:val="1A1A1A"/>
-          <w:sz w:val="18"/>
-          <w:szCs w:val="18"/>
-          <w:lang w:val="en-US"/>
-        </w:rPr>
-        <w:t>Automated SAP trial-balance consolidation into Magnitude statements using Excel/VBA, account mapping, debit/credit controls and PDF export.</w:t>
-      </w:r>
-    </w:p>
-    <w:p>
-      <w:pPr>
-        <w:tabs>
-          <w:tab w:val="right" w:pos="10306"/>
-        </w:tabs>
-        <w:spacing w:before="100"/>
-        <w:rPr>
-          <w:sz w:val="18"/>
-          <w:szCs w:val="18"/>
-          <w:lang w:val="en-US"/>
-        </w:rPr>
-      </w:pPr>
-      <w:r>
-        <w:rPr>
-          <w:b/>
-          <w:bCs/>
-          <w:color w:val="1A1A1A"/>
-          <w:sz w:val="20"/>
-          <w:szCs w:val="20"/>
-          <w:lang w:val="en-US"/>
-        </w:rPr>
-        <w:t>BTP COPILOT — AI Tendering Product Framing</w:t>
+        <w:jc w:val="both"/>
+      </w:pPr>
+      <w:r>
+        <w:rPr>
+          <w:color w:val="1A1A1A"/>
+        </w:rPr>
+        <w:t xml:space="preserve">Built adoption and retention levers: “Today” page (daily actions and follow-ups), morning email digest sent only when there is an action, interview and milestone notifications; aggregated, identity-free counters to measure whether reminders help.</w:t>
       </w:r>
     </w:p>
     <w:p>
@@ -1225,20 +1044,194 @@
           <w:numId w:val="2"/>
         </w:numPr>
         <w:spacing w:before="20" w:after="20"/>
-        <w:rPr>
-          <w:sz w:val="18"/>
-          <w:szCs w:val="18"/>
-          <w:lang w:val="en-US"/>
-        </w:rPr>
-      </w:pPr>
-      <w:r>
-        <w:rPr>
-          <w:color w:val="1A1A1A"/>
-          <w:sz w:val="18"/>
-          <w:szCs w:val="18"/>
-          <w:lang w:val="en-US"/>
-        </w:rPr>
-        <w:t>Framed an AI copilot for construction SMEs: BOAMP/TED/DECP monitoring, go/no-go and tender analysis with traceable evidence/unknowns; Supabase/Hermes architecture, human review, no automatic submission.</w:t>
+        <w:jc w:val="both"/>
+      </w:pPr>
+      <w:r>
+        <w:rPr>
+          <w:color w:val="1A1A1A"/>
+        </w:rPr>
+        <w:t xml:space="preserve">Developed offer-to-background compatibility analysis and ATS check: requirements ranked proven/transferable/missing with the supporting evidence cited, ATS reading findings (Workday, Greenhouse, Taleo…), no opaque score: informed decision to apply.</w:t>
+      </w:r>
+    </w:p>
+    <w:p>
+      <w:pPr>
+        <w:pStyle w:val="Paragraphedeliste"/>
+        <w:numPr>
+          <w:ilvl w:val="0"/>
+          <w:numId w:val="2"/>
+        </w:numPr>
+        <w:spacing w:before="20" w:after="20"/>
+        <w:jc w:val="both"/>
+      </w:pPr>
+      <w:r>
+        <w:rPr>
+          <w:color w:val="1A1A1A"/>
+        </w:rPr>
+        <w:t xml:space="preserve">Designed résumé tailoring per offer: new résumé in the original layout, controls blocking any unsupported figure, date, tool or language level, confirmation questions to the user and line-by-line review before export.</w:t>
+      </w:r>
+    </w:p>
+    <w:p>
+      <w:pPr>
+        <w:pStyle w:val="Paragraphedeliste"/>
+        <w:numPr>
+          <w:ilvl w:val="0"/>
+          <w:numId w:val="2"/>
+        </w:numPr>
+        <w:spacing w:before="20" w:after="20"/>
+        <w:jc w:val="both"/>
+      </w:pPr>
+      <w:r>
+        <w:rPr>
+          <w:color w:val="1A1A1A"/>
+        </w:rPr>
+        <w:t xml:space="preserve">Integrated a free offer watch (36 employers via 8 public-API ATS, job-board email alerts), with the offers closest to the user’s background first.</w:t>
+      </w:r>
+    </w:p>
+    <w:p>
+      <w:pPr>
+        <w:pStyle w:val="Paragraphedeliste"/>
+        <w:numPr>
+          <w:ilvl w:val="0"/>
+          <w:numId w:val="2"/>
+        </w:numPr>
+        <w:spacing w:before="20" w:after="20"/>
+        <w:jc w:val="both"/>
+      </w:pPr>
+      <w:r>
+        <w:rPr>
+          <w:color w:val="1A1A1A"/>
+        </w:rPr>
+        <w:t xml:space="preserve">Set up monetisation: Stripe Checkout credits, debit reserved then released on failure; consent-based PostHog analytics; GDPR/AI Act compliance.</w:t>
+      </w:r>
+    </w:p>
+    <w:p>
+      <w:pPr>
+        <w:pBdr>
+          <w:bottom w:val="single" w:sz="6" w:space="2" w:color="C9931A"/>
+        </w:pBdr>
+        <w:spacing w:before="130" w:after="50"/>
+        <w:rPr>
+          <w:sz w:val="18"/>
+          <w:szCs w:val="18"/>
+          <w:lang w:val="en-US"/>
+        </w:rPr>
+      </w:pPr>
+      <w:r>
+        <w:rPr>
+          <w:b/>
+          <w:bCs/>
+          <w:color w:val="C9931A"/>
+          <w:sz w:val="20"/>
+          <w:szCs w:val="20"/>
+          <w:lang w:val="en-US"/>
+        </w:rPr>
+        <w:t>EDUCATION</w:t>
+      </w:r>
+    </w:p>
+    <w:p>
+      <w:pPr>
+        <w:tabs>
+          <w:tab w:val="right" w:pos="10306"/>
+        </w:tabs>
+        <w:spacing w:before="100"/>
+        <w:rPr>
+          <w:sz w:val="18"/>
+          <w:szCs w:val="18"/>
+          <w:lang w:val="en-US"/>
+        </w:rPr>
+      </w:pPr>
+      <w:r>
+        <w:rPr>
+          <w:b/>
+          <w:bCs/>
+          <w:color w:val="1A1A1A"/>
+          <w:sz w:val="20"/>
+          <w:szCs w:val="20"/>
+          <w:lang w:val="en-US"/>
+        </w:rPr>
+        <w:t>INSEEC Paris</w:t>
+      </w:r>
+      <w:r>
+        <w:rPr>
+          <w:color w:val="666666"/>
+          <w:sz w:val="18"/>
+          <w:szCs w:val="18"/>
+          <w:lang w:val="en-US"/>
+        </w:rPr>
+        <w:tab/>
+        <w:t>Sep 2025 – Sep 2026</w:t>
+      </w:r>
+    </w:p>
+    <w:p>
+      <w:pPr>
+        <w:spacing w:before="20" w:after="10"/>
+        <w:rPr>
+          <w:sz w:val="18"/>
+          <w:szCs w:val="18"/>
+          <w:lang w:val="en-US"/>
+        </w:rPr>
+      </w:pPr>
+      <w:r>
+        <w:rPr>
+          <w:color w:val="1A1A1A"/>
+          <w:sz w:val="18"/>
+          <w:szCs w:val="18"/>
+          <w:lang w:val="en-US"/>
+        </w:rPr>
+        <w:t>MSc Business Development</w:t>
+      </w:r>
+    </w:p>
+    <w:p>
+      <w:pPr>
+        <w:tabs>
+          <w:tab w:val="right" w:pos="10306"/>
+        </w:tabs>
+        <w:spacing w:before="100"/>
+        <w:rPr>
+          <w:sz w:val="18"/>
+          <w:szCs w:val="18"/>
+          <w:lang w:val="en-US"/>
+        </w:rPr>
+      </w:pPr>
+      <w:r>
+        <w:rPr>
+          <w:b/>
+          <w:bCs/>
+          <w:color w:val="1A1A1A"/>
+          <w:sz w:val="20"/>
+          <w:szCs w:val="20"/>
+          <w:lang w:val="en-US"/>
+        </w:rPr>
+        <w:t>Euridis Business School</w:t>
+      </w:r>
+      <w:r>
+        <w:rPr>
+          <w:color w:val="666666"/>
+          <w:sz w:val="18"/>
+          <w:szCs w:val="18"/>
+          <w:lang w:val="en-US"/>
+        </w:rPr>
+        <w:tab/>
+        <w:t>Sep 2022 – Nov 2024</w:t>
+      </w:r>
+    </w:p>
+    <w:p>
+      <w:pPr>
+        <w:spacing w:before="20" w:after="10"/>
+        <w:rPr>
+          <w:sz w:val="18"/>
+          <w:szCs w:val="18"/>
+          <w:lang w:val="en-US"/>
+        </w:rPr>
+      </w:pPr>
+      <w:r>
+        <w:rPr>
+          <w:color w:val="1A1A1A"/>
+          <w:sz w:val="18"/>
+          <w:szCs w:val="18"/>
+          <w:lang w:val="en-US"/>
+        </w:rPr>
+        <w:t>Master in Sales Engineering</w:t>
       </w:r>
     </w:p>
     <w:p>

</xml_diff>